<commit_message>
6-book DOCX defect repair: teen text fixes from completeness gate
Real misses surfaced by completeness_check after the parser fix
(Habakkuk 3 'four winds', Haggai 1:12 patronymics Shealtiel/Jehozadak,
Haggai 2:15 'first', Obadiah 1:8 'God's sure word', Jonah 3 badge 6-9,
Zephaniah 2:9 'field of rocks' per MSG standard — EN had 'weeds',
contradicting both MSG and its own KO).
Rebuilt all 6 DOCX with the fixed parser; validator PASS, VERIFY_DROPPED=0,
pairing-content verifier OK (incl. new badge-only MSG cell gate).
Remaining completeness flags triaged as checker false positives
(stemming/hyphen/synonym gaps: Israelites, money-making, twice,
passersby->'people who walk by', Word->'message' paraphrases).
</commit_message>
<xml_diff>
--- a/gdocs_build/Haggai.docx
+++ b/gdocs_build/Haggai.docx
@@ -146,7 +146,7 @@
               <w:rPr>
                 <w:sz w:val="18"/>
               </w:rPr>
-              <w:t>On the first day of the sixth month of the second year in the reign of King Darius of Persia, God’s Message was delivered by the prophet Haggai to the governor of Judah, Zerubbabel son of Shealtiel, and to the high priest, Joshua son of Jehozadak: 2 A Message from God-of-the-Angel-Armies: “The people procrastinate. They say this isn’t the right time to rebuild my Temple, the Temple of God.” 3-4 Shortly after that, God said more and Haggai spoke it: “How is it that it’s the ‘right time’ for you to live in your fine new homes while the Home, God’s Temple, is in ruins?” 5-6 And then a little later, God-of-the-Angel-Armies spoke out again:“Take a good, hard look at your life. Think it over. You have spent a lot of money, but you haven’t much to show for it. You keep filling your plates, but you never get filled up. You keep drinking and drinking and drinking, but you’re always thirsty. You put on layer after layer of clothes, but you can’t get warm. And the people who work for you, what are they getting out of it? Not much— a leaky, rusted-out bucket, that’s what.” 7 That’s why God-of-the-Angel-Armies said:“Take a good, hard look at your life. Think it over.”* * * 8-9 Then God said:“Here’s what I want you to do: Climb into the hills and cut some timber. Bring it down and rebuild the Temple. Do it just for me. Honor me. You’ve had great ambitions for yourselves, but nothing has come of it. The little you have brought to my Temple I’ve blown away—there was nothing to it.9-11 “And why?” (This is a Message from God-of-the-Angel-Armies, remember.) “Because while you’ve run around, caught up with taking care of your own houses, my Home is in ruins. That’s why. Because of your stinginess. And so I’ve given you a dry summer and a meager crop. I’ve matched your tight-fisted stinginess by decreeing a season of drought, drying up fields and hills, withering gardens and orchards, stunting vegetables and fruit. Nothing—not man or woman, not animal or crop—is going to thrive.”* * * 12 Then the governor, Zerubbabel son of Shealtiel, and the high priest, Joshua son of Jehozadak, and all the people with them listened, really listened, to the voice of their God. When God sent the prophet Haggai to them, they paid attention to him. In listening to Haggai, they honored God. 13 Then Haggai, God’s messenger, preached God’s Message to the people: “I am with you!” God’s Word. 14-15 This is how God got Zerubbabel, Joshua, and all the people moving—got them working on the Temple of God-of-the-Angel-Armies. This happened on the twenty-fourth day of the sixth month in the second year of King Darius.</w:t>
+              <w:t>On the first day of the sixth month of the second year in the reign of King Darius of Persia, God’s Message was delivered by the prophet Haggai to the governor of Judah, Zerubbabel son of Shealtiel, and to the high priest, Joshua son of Jehozadak:</w:t>
             </w:r>
           </w:p>
         </w:tc>
@@ -217,6 +217,7 @@
               <w:rPr>
                 <w:sz w:val="18"/>
               </w:rPr>
+              <w:t>A Message from God-of-the-Angel-Armies: “The people procrastinate. They say this isn’t the right time to rebuild my Temple, the Temple of God.”</w:t>
             </w:r>
           </w:p>
         </w:tc>
@@ -287,6 +288,7 @@
               <w:rPr>
                 <w:sz w:val="18"/>
               </w:rPr>
+              <w:t>Shortly after that, God said more and Haggai spoke it: “How is it that it’s the ‘right time’ for you to live in your fine new homes while the Home, God’s Temple, is in ruins?”</w:t>
             </w:r>
           </w:p>
         </w:tc>
@@ -357,6 +359,7 @@
               <w:rPr>
                 <w:sz w:val="18"/>
               </w:rPr>
+              <w:t>And then a little later, God-of-the-Angel-Armies spoke out again:“Take a good, hard look at your life. Think it over. You have spent a lot of money, but you haven’t much to show for it. You keep filling your plates, but you never get filled up. You keep drinking and drinking and drinking, but you’re always thirsty. You put on layer after layer of clothes, but you can’t get warm. And the people who work for you, what are they getting out of it? Not much— a leaky, rusted-out bucket, that’s what.”</w:t>
             </w:r>
           </w:p>
         </w:tc>
@@ -427,6 +430,7 @@
               <w:rPr>
                 <w:sz w:val="18"/>
               </w:rPr>
+              <w:t>That’s why God-of-the-Angel-Armies said:“Take a good, hard look at your life. Think it over.”* * *</w:t>
             </w:r>
           </w:p>
         </w:tc>
@@ -497,6 +501,7 @@
               <w:rPr>
                 <w:sz w:val="18"/>
               </w:rPr>
+              <w:t>Then God said:“Here’s what I want you to do: Climb into the hills and cut some timber. Bring it down and rebuild the Temple. Do it just for me. Honor me. You’ve had great ambitions for yourselves, but nothing has come of it. The little you have brought to my Temple I’ve blown away—there was nothing to it.</w:t>
             </w:r>
           </w:p>
         </w:tc>
@@ -567,6 +572,7 @@
               <w:rPr>
                 <w:sz w:val="18"/>
               </w:rPr>
+              <w:t>“And why?” (This is a Message from God-of-the-Angel-Armies, remember.) “Because while you’ve run around, caught up with taking care of your own houses, my Home is in ruins. That’s why. Because of your stinginess. And so I’ve given you a dry summer and a meager crop. I’ve matched your tight-fisted stinginess by decreeing a season of drought, drying up fields and hills, withering gardens and orchards, stunting vegetables and fruit. Nothing—not man or woman, not animal or crop—is going to thrive.”* * *</w:t>
             </w:r>
           </w:p>
         </w:tc>
@@ -637,6 +643,7 @@
               <w:rPr>
                 <w:sz w:val="18"/>
               </w:rPr>
+              <w:t>Then the governor, Zerubbabel son of Shealtiel, and the high priest, Joshua son of Jehozadak, and all the people with them listened, really listened, to the voice of their God. When God sent the prophet Haggai to them, they paid attention to him. In listening to Haggai, they honored God.</w:t>
             </w:r>
           </w:p>
         </w:tc>
@@ -659,7 +666,7 @@
               <w:rPr>
                 <w:sz w:val="18"/>
               </w:rPr>
-              <w:t>Then Zerubbabel the governor, Joshua the high priest, and all the people with them actually listened to the voice of their God. When God sent Haggai the prophet to them, they paid attention. By listening to Haggai, they were showing God respect.</w:t>
+              <w:t>Then Governor Zerubbabel son of Shealtiel, High Priest Joshua son of Jehozadak, and all the people with them actually listened to the voice of their God. When God sent Haggai the prophet to them, they paid attention. By listening to Haggai, they were showing God respect.</w:t>
             </w:r>
           </w:p>
         </w:tc>
@@ -682,7 +689,7 @@
               <w:rPr>
                 <w:sz w:val="18"/>
               </w:rPr>
-              <w:t>그제서야 총독 스룹바벨이랑 대제사장 여호수아, 그리고 그들과 함께 있던 모든 백성이 자기들 하나님의 목소리를 진짜로 귀담아들었대. 하나님이 학개 선지자를 보냈을 때, 그들은 그에게 집중했어. 학개의 말을 듣는 것으로 하나님께 경의를 표한 거지.</w:t>
+              <w:t>그제서야 스알디엘의 아들 총독 스룹바벨이랑 여호사닥의 아들 대제사장 여호수아, 그리고 그들과 함께 있던 모든 백성이 자기들 하나님의 목소리를 진짜로 귀담아들었대. 하나님이 학개 선지자를 보냈을 때, 그들은 그에게 집중했어. 학개의 말을 듣는 것으로 하나님께 경의를 표한 거지.</w:t>
             </w:r>
           </w:p>
         </w:tc>
@@ -707,6 +714,7 @@
               <w:rPr>
                 <w:sz w:val="18"/>
               </w:rPr>
+              <w:t>Then Haggai, God’s messenger, preached God’s Message to the people: “I am with you!” God’s Word.</w:t>
             </w:r>
           </w:p>
         </w:tc>
@@ -777,6 +785,7 @@
               <w:rPr>
                 <w:sz w:val="18"/>
               </w:rPr>
+              <w:t>This is how God got Zerubbabel, Joshua, and all the people moving—got them working on the Temple of God-of-the-Angel-Armies. This happened on the twenty-fourth day of the sixth month in the second year of King Darius.</w:t>
             </w:r>
           </w:p>
         </w:tc>
@@ -959,7 +968,7 @@
               <w:rPr>
                 <w:sz w:val="18"/>
               </w:rPr>
-              <w:t>On the twenty-first day of the seventh month, the Word of God came through the prophet Haggai: “Tell Governor Zerubbabel son of Shealtiel and High Priest Joshua son of Jehozadak and all the people: ‘Is there anyone here who saw the Temple the way it used to be, all glorious? And what do you see now? Not much, right? 4-5 “‘So get to work, Zerubbabel!’—God is speaking.“‘Get to work, Joshua son of Jehozadak—high priest!’“‘Get to work, all you people!’—God is speaking.“‘Yes, get to work! For I am with you.’ The God-of-the-Angel-Armies is speaking! ‘Put into action the word I covenanted with you when you left Egypt. I’m living and breathing among you right now. Don’t be timid. Don’t hold back.’ 6-7 “This is what God-of-the-Angel-Armies said: ‘Before you know it, I will shake up sky and earth, ocean and fields. And I’ll shake down all the godless nations. They’ll bring bushels of wealth and I will fill this Temple with splendor.’ God-of-the-Angel-Armies says so. 8     ‘I own the silver, I own the gold.’ Decree of God-of-the-Angel-Armies. 9 “‘This Temple is going to end up far better than it started out, a glorious beginning but an even more glorious finish: a place in which I will hand out wholeness and holiness.’ Decree of God-of-the-Angel-Armies.”* * * 10-12 On the twenty-fourth day of the ninth month (again, this was in the second year of Darius), God’s Message came to Haggai: “God-of-the-Angel-Armies speaks: Consult the priests for a ruling. If someone carries a piece of sacred meat in his pocket, meat that is set apart for sacrifice on the altar, and the pocket touches a loaf of bread, a dish of stew, a bottle of wine or oil, or any other food, will these foods be made holy by such contact?”The priests said, “No.” 13 Then Haggai said, “How about someone who is contaminated by touching a corpse—if that person touches one of these foods, will it be contaminated?”The priests said, “Yes, it will be contaminated.” 14 Then Haggai said, “‘So, this people is contaminated. Their nation is contaminated. Everything they do is contaminated. Whatever they do for me is contaminated.’ God says so. 15-17 “‘Think back. Before you set out to lay the first foundation stones for the rebuilding of my Temple, how did it go with you? Isn’t it true that your foot-dragging, halfhearted efforts at rebuilding the Temple of God were reflected in a sluggish, halfway return on your crops—half the grain you were used to getting, half the wine? I hit you with drought and blight and hail. Everything you were doing got hit. But it didn’t seem to faze you. You continued to ignore me.’ God’s Decree. 18-19 “‘Now think ahead from this same date—this twenty-fourth day of the ninth month. Think ahead from when the Temple rebuilding was launched. Has anything in your fields—vine, fig tree, pomegranate, olive tree—failed to flourish? From now on you can count on a blessing.’”* * * 20-21 God’s Message came a second time to Haggai on that most memorable day, the twenty-fourth day of the ninth month: “Speak to Zerubbabel, the governor of Judah:</w:t>
+              <w:t>On the twenty-first day of the seventh month, the Word of God came through the prophet Haggai: “Tell Governor Zerubbabel son of Shealtiel and High Priest Joshua son of Jehozadak and all the people: ‘Is there anyone here who saw the Temple the way it used to be, all glorious? And what do you see now? Not much, right?</w:t>
             </w:r>
           </w:p>
         </w:tc>
@@ -1030,6 +1039,7 @@
               <w:rPr>
                 <w:sz w:val="18"/>
               </w:rPr>
+              <w:t>“‘So get to work, Zerubbabel!’—God is speaking.“‘Get to work, Joshua son of Jehozadak—high priest!’“‘Get to work, all you people!’—God is speaking.“‘Yes, get to work! For I am with you.’ The God-of-the-Angel-Armies is speaking! ‘Put into action the word I covenanted with you when you left Egypt. I’m living and breathing among you right now. Don’t be timid. Don’t hold back.’</w:t>
             </w:r>
           </w:p>
         </w:tc>
@@ -1100,6 +1110,7 @@
               <w:rPr>
                 <w:sz w:val="18"/>
               </w:rPr>
+              <w:t>↑ 위 MSG(4-5) 계속</w:t>
             </w:r>
           </w:p>
         </w:tc>
@@ -1170,6 +1181,7 @@
               <w:rPr>
                 <w:sz w:val="18"/>
               </w:rPr>
+              <w:t>↑ 위 MSG(4-5) 계속</w:t>
             </w:r>
           </w:p>
         </w:tc>
@@ -1240,6 +1252,7 @@
               <w:rPr>
                 <w:sz w:val="18"/>
               </w:rPr>
+              <w:t>↑ 위 MSG(4-5) 계속</w:t>
             </w:r>
           </w:p>
         </w:tc>
@@ -1310,6 +1323,7 @@
               <w:rPr>
                 <w:sz w:val="18"/>
               </w:rPr>
+              <w:t>“This is what God-of-the-Angel-Armies said: ‘Before you know it, I will shake up sky and earth, ocean and fields. And I’ll shake down all the godless nations. They’ll bring bushels of wealth and I will fill this Temple with splendor.’ God-of-the-Angel-Armies says so.</w:t>
             </w:r>
           </w:p>
         </w:tc>
@@ -1380,6 +1394,7 @@
               <w:rPr>
                 <w:sz w:val="18"/>
               </w:rPr>
+              <w:t>‘I own the silver, I own the gold.’ Decree of God-of-the-Angel-Armies.</w:t>
             </w:r>
           </w:p>
         </w:tc>
@@ -1450,6 +1465,7 @@
               <w:rPr>
                 <w:sz w:val="18"/>
               </w:rPr>
+              <w:t>“‘This Temple is going to end up far better than it started out, a glorious beginning but an even more glorious finish: a place in which I will hand out wholeness and holiness.’ Decree of God-of-the-Angel-Armies.”* * *</w:t>
             </w:r>
           </w:p>
         </w:tc>
@@ -1520,6 +1536,7 @@
               <w:rPr>
                 <w:sz w:val="18"/>
               </w:rPr>
+              <w:t>On the twenty-fourth day of the ninth month (again, this was in the second year of Darius), God’s Message came to Haggai: “God-of-the-Angel-Armies speaks: Consult the priests for a ruling. If someone carries a piece of sacred meat in his pocket, meat that is set apart for sacrifice on the altar, and the pocket touches a loaf of bread, a dish of stew, a bottle of wine or oil, or any other food, will these foods be made holy by such contact?”The priests said, “No.”</w:t>
             </w:r>
           </w:p>
         </w:tc>
@@ -1590,6 +1607,7 @@
               <w:rPr>
                 <w:sz w:val="18"/>
               </w:rPr>
+              <w:t>↑ 위 MSG(10-12) 계속</w:t>
             </w:r>
           </w:p>
         </w:tc>
@@ -1660,6 +1678,7 @@
               <w:rPr>
                 <w:sz w:val="18"/>
               </w:rPr>
+              <w:t>Then Haggai said, “How about someone who is contaminated by touching a corpse—if that person touches one of these foods, will it be contaminated?”The priests said, “Yes, it will be contaminated.”</w:t>
             </w:r>
           </w:p>
         </w:tc>
@@ -1730,6 +1749,7 @@
               <w:rPr>
                 <w:sz w:val="18"/>
               </w:rPr>
+              <w:t>↑ 위 MSG(13-13) 계속</w:t>
             </w:r>
           </w:p>
         </w:tc>
@@ -1800,6 +1820,7 @@
               <w:rPr>
                 <w:sz w:val="18"/>
               </w:rPr>
+              <w:t>Then Haggai said, “‘So, this people is contaminated. Their nation is contaminated. Everything they do is contaminated. Whatever they do for me is contaminated.’ God says so.</w:t>
             </w:r>
           </w:p>
         </w:tc>
@@ -1870,6 +1891,7 @@
               <w:rPr>
                 <w:sz w:val="18"/>
               </w:rPr>
+              <w:t>“‘Think back. Before you set out to lay the first foundation stones for the rebuilding of my Temple, how did it go with you? Isn’t it true that your foot-dragging, halfhearted efforts at rebuilding the Temple of God were reflected in a sluggish, halfway return on your crops—half the grain you were used to getting, half the wine? I hit you with drought and blight and hail. Everything you were doing got hit. But it didn’t seem to faze you. You continued to ignore me.’ God’s Decree.</w:t>
             </w:r>
           </w:p>
         </w:tc>
@@ -1892,7 +1914,7 @@
               <w:rPr>
                 <w:sz w:val="18"/>
               </w:rPr>
-              <w:t>"'Think about it. Before you started laying the foundation stones for my Temple again, how were things for you? Isn't it true that because you were dragging your feet and only giving a half-hearted effort to rebuild, your crops were also only giving you half of what you expected? I sent drought and disease and hail. Everything you tried to do got messed up. But it didn't even seem to bother you. You just kept ignoring me.' God's decree.</w:t>
+              <w:t>"'Think about it. Before you started laying the first foundation stones for my Temple again, how were things for you? Isn't it true that because you were dragging your feet and only giving a half-hearted effort to rebuild, your crops were also only giving you half of what you expected? I sent drought and disease and hail. Everything you tried to do got messed up. But it didn't even seem to bother you. You just kept ignoring me.' God's decree.</w:t>
             </w:r>
           </w:p>
         </w:tc>
@@ -1915,7 +1937,7 @@
               <w:rPr>
                 <w:sz w:val="18"/>
               </w:rPr>
-              <w:t>"'한번 잘 생각해봐라. 너네가 내 성전 다시 짓는다고 기초석 놓기 전에, 상황이 어땠냐? 너네가 성전 짓는 거 질질 끌고 대충대충 하니까, 농사도 맨날 하던 거에 비해 반밖에 못 거두고 그랬잖아. 내가 가뭄이랑 병충해랑 우박으로 너네가 하는 일마다 다 망쳐놨음. 근데도 너네는 정신 못 차리고 계속 나 무시했잖아.' 하나님의 말씀이래.</w:t>
+              <w:t>"'한번 잘 생각해봐라. 너네가 내 성전 다시 짓는다고 첫 기초석 놓기 전에, 상황이 어땠냐? 너네가 성전 짓는 거 질질 끌고 대충대충 하니까, 농사도 맨날 하던 거에 비해 반밖에 못 거두고 그랬잖아. 내가 가뭄이랑 병충해랑 우박으로 너네가 하는 일마다 다 망쳐놨음. 근데도 너네는 정신 못 차리고 계속 나 무시했잖아.' 하나님의 말씀이래.</w:t>
             </w:r>
           </w:p>
         </w:tc>
@@ -1940,6 +1962,7 @@
               <w:rPr>
                 <w:sz w:val="18"/>
               </w:rPr>
+              <w:t>“‘Now think ahead from this same date—this twenty-fourth day of the ninth month. Think ahead from when the Temple rebuilding was launched. Has anything in your fields—vine, fig tree, pomegranate, olive tree—failed to flourish? From now on you can count on a blessing.’”* * *</w:t>
             </w:r>
           </w:p>
         </w:tc>
@@ -2010,7 +2033,7 @@
               <w:rPr>
                 <w:sz w:val="18"/>
               </w:rPr>
-              <w:t>“‘I am about to shake up everything, to turn everything upside down and start over from top to bottom—overthrow governments, destroy foreign powers, dismantle the world of weapons and armaments, throw armies into confusion, so that they end up killing one another. And on that day’”—this is God’s Message—“‘I will take you, O Zerubbabel son of Shealtiel, as my personal servant and I will set you as a signet ring, the sign of my sovereign presence and authority. I’ve looked over the field and chosen you for this work.’” The Message of God-of-the-Angel-Armies.</w:t>
+              <w:t>God’s Message came a second time to Haggai on that most memorable day, the twenty-fourth day of the ninth month: “Speak to Zerubbabel, the governor of Judah:</w:t>
             </w:r>
           </w:p>
         </w:tc>
@@ -2081,7 +2104,7 @@
               <w:rPr>
                 <w:sz w:val="18"/>
               </w:rPr>
-              <w:t>↑ 위 MSG(21-23) 계속</w:t>
+              <w:t>“‘I am about to shake up everything, to turn everything upside down and start over from top to bottom—overthrow governments, destroy foreign powers, dismantle the world of weapons and armaments, throw armies into confusion, so that they end up killing one another. And on that day’”—this is God’s Message—“‘I will take you, O Zerubbabel son of Shealtiel, as my personal servant and I will set you as a signet ring, the sign of my sovereign presence and authority. I’ve looked over the field and chosen you for this work.’” The Message of God-of-the-Angel-Armies.</w:t>
             </w:r>
           </w:p>
         </w:tc>

</xml_diff>

<commit_message>
Haggai 2nd re-audit: 1 MSG omission restored (EN/KO), GDocs 2/2 verified
</commit_message>
<xml_diff>
--- a/gdocs_build/Haggai.docx
+++ b/gdocs_build/Haggai.docx
@@ -2037,7 +2037,7 @@
               <w:rPr>
                 <w:sz w:val="18"/>
               </w:rPr>
-              <w:t>"'Think back. Before you set out to lay the first foundation stones for my Temple again, how were things for you? Isn't it true that because you were dragging your feet and only giving a half-hearted effort to rebuild, your crops were also only giving you half of what you were used to—half the grain, half the wine? I sent drought and disease and hail. Everything you tried to do got messed up. But it didn't even seem to faze you. You just kept ignoring me.' God's decree.</w:t>
+              <w:t>"'Think back. Before you set out to lay the first foundation stones for my Temple again, how were things for you? Isn't it true that because you were dragging your feet and only giving a half-hearted effort to rebuild the Temple of God, your crops were also only giving you half of what you were used to—half the grain, half the wine? I sent drought and disease and hail. Everything you tried to do got messed up. But it didn't even seem to faze you. You just kept ignoring me.' God's decree.</w:t>
             </w:r>
           </w:p>
         </w:tc>
@@ -2060,7 +2060,7 @@
               <w:rPr>
                 <w:sz w:val="18"/>
               </w:rPr>
-              <w:t>"'한번 잘 생각해봐라. 너네가 내 성전 다시 짓는다고 첫 기초석을 놓기 전에, 상황이 어땠냐? 너네가 성전 짓는 거 질질 끌고 대충대충 하니까, 농사도 반밖에 못 거뒀잖아. 예전에 거두던 곡식의 절반, 포도주도 절반이었지. 내가 가뭄이랑 병충해랑 우박으로 너네가 하는 일마다 다 망쳐놨음. 근데도 너네는 정신 못 차리고 계속 나 무시했잖아.' 하나님의 말씀이래.</w:t>
+              <w:t>"'한번 잘 생각해봐라. 너네가 내 성전 다시 짓는다고 첫 기초석을 놓기 전에, 상황이 어땠냐? 너네가 하나님의 성전 짓는 거 질질 끌고 대충대충 하니까, 농사도 반밖에 못 거뒀잖아. 예전에 거두던 곡식의 절반, 포도주도 절반이었지. 내가 가뭄이랑 병충해랑 우박으로 너네가 하는 일마다 다 망쳐놨음. 근데도 너네는 정신 못 차리고 계속 나 무시했잖아.' 하나님의 말씀이래.</w:t>
             </w:r>
           </w:p>
         </w:tc>

</xml_diff>

<commit_message>
Haggai 배지 정밀화 (OT 전수조사): 2곳 (EN+KO) — 1:3 '5'→'5-6', 1:7 '8'→'8-9' 과소 표기 교정. 독스 2/2 export-back OK.
</commit_message>
<xml_diff>
--- a/gdocs_build/Haggai.docx
+++ b/gdocs_build/Haggai.docx
@@ -306,7 +306,7 @@
                 <w:b/>
                 <w:sz w:val="16"/>
               </w:rPr>
-              <w:t>5</w:t>
+              <w:t>5-6</w:t>
             </w:r>
           </w:p>
           <w:p>
@@ -329,7 +329,7 @@
                 <w:b/>
                 <w:sz w:val="16"/>
               </w:rPr>
-              <w:t>5</w:t>
+              <w:t>5-6</w:t>
             </w:r>
           </w:p>
           <w:p>
@@ -352,7 +352,7 @@
                 <w:b/>
                 <w:sz w:val="16"/>
               </w:rPr>
-              <w:t>5</w:t>
+              <w:t>5-6</w:t>
             </w:r>
           </w:p>
           <w:p>
@@ -590,7 +590,7 @@
                 <w:b/>
                 <w:sz w:val="16"/>
               </w:rPr>
-              <w:t>8</w:t>
+              <w:t>8-9</w:t>
             </w:r>
           </w:p>
           <w:p>
@@ -613,7 +613,7 @@
                 <w:b/>
                 <w:sz w:val="16"/>
               </w:rPr>
-              <w:t>8</w:t>
+              <w:t>8-9</w:t>
             </w:r>
           </w:p>
           <w:p>
@@ -636,7 +636,7 @@
                 <w:b/>
                 <w:sz w:val="16"/>
               </w:rPr>
-              <w:t>8</w:t>
+              <w:t>8-9</w:t>
             </w:r>
           </w:p>
           <w:p>

</xml_diff>